<commit_message>
Add data automation composition playbook
</commit_message>
<xml_diff>
--- a/templates/data-analysis-agent-requirement-form.docx
+++ b/templates/data-analysis-agent-requirement-form.docx
@@ -2113,7 +2113,7 @@
                 <w:color w:val="1F4D78"/>
                 <w:sz w:val="20"/>
               </w:rPr>
-              <w:t>작업 유형</w:t>
+              <w:t>분석 유형</w:t>
             </w:r>
           </w:p>
         </w:tc>
@@ -2134,7 +2134,55 @@
                 <w:color w:val="667085"/>
                 <w:sz w:val="20"/>
               </w:rPr>
-              <w:t>분석 / 데이터 정리 / 대시보드 / 자동 알림 / 기존 agent 점검 중 무엇에 가까운가?</w:t>
+              <w:t>데이터 분석 / 데이터 정리 / 피드백 분석 / 대시보드 / 기존 agent 점검 중 무엇에 가까운가?</w:t>
+            </w:r>
+          </w:p>
+        </w:tc>
+      </w:tr>
+      <w:tr>
+        <w:trPr>
+          <w:trHeight w:hRule="atLeast"/>
+        </w:trPr>
+        <w:tc>
+          <w:tcPr>
+            <w:tcW w:type="dxa" w:w="1850"/>
+            <w:vAlign w:val="center"/>
+            <w:shd w:fill="F2F4F7"/>
+          </w:tcPr>
+          <w:p>
+            <w:pPr>
+              <w:spacing w:after="0" w:line="276" w:lineRule="auto"/>
+            </w:pPr>
+            <w:r/>
+            <w:r>
+              <w:rPr>
+                <w:rFonts w:ascii="Calibri" w:hAnsi="Calibri"/>
+                <w:b/>
+                <w:color w:val="1F4D78"/>
+                <w:sz w:val="20"/>
+              </w:rPr>
+              <w:t>자동화 유형</w:t>
+            </w:r>
+          </w:p>
+        </w:tc>
+        <w:tc>
+          <w:tcPr>
+            <w:tcW w:type="dxa" w:w="7510"/>
+            <w:vAlign w:val="center"/>
+          </w:tcPr>
+          <w:p>
+            <w:pPr>
+              <w:spacing w:after="0" w:line="276" w:lineRule="auto"/>
+            </w:pPr>
+            <w:r/>
+            <w:r>
+              <w:rPr>
+                <w:rFonts w:ascii="Calibri" w:hAnsi="Calibri"/>
+                <w:b w:val="0"/>
+                <w:color w:val="667085"/>
+                <w:sz w:val="20"/>
+              </w:rPr>
+              <w:t>반복 리포트 / 대시보드 갱신 / 알림 queue / 회의 follow-up / 자동화 보류 중 무엇인가?</w:t>
             </w:r>
           </w:p>
         </w:tc>
@@ -2411,7 +2459,7 @@
                 <w:color w:val="667085"/>
                 <w:sz w:val="20"/>
               </w:rPr>
-              <w:t>위 요청 카드를 바탕으로 필요한 자료를 먼저 확인하고, 분석/자동화 방식을 제안한 뒤, 검증 기준과 승인 필요한 일을 분리해서 실행 계획을 작성해주세요.</w:t>
+              <w:t>위 요청 카드를 바탕으로 필요한 자료를 먼저 확인하고, 데이터 분석 유형과 자동화 유형을 나눠 제안한 뒤, 검증 기준과 승인 필요한 일을 분리해서 실행 계획을 작성해주세요.</w:t>
             </w:r>
           </w:p>
           <w:p>

</xml_diff>